<commit_message>
Update Orchestrator KB for non compete triage signals
</commit_message>
<xml_diff>
--- a/docs/orchestrator_kb.docx
+++ b/docs/orchestrator_kb.docx
@@ -103,7 +103,7 @@
     <w:p>
       <w:pPr>
         <w:rPr>
-          <w:rFonts w:ascii="Aptos" w:eastAsia="Aptos" w:hAnsi="Aptos" w:cs="Aptos" w:hint="eastAsia"/>
+          <w:rFonts w:ascii="Aptos" w:eastAsia="Aptos" w:hAnsi="Aptos" w:cs="Aptos"/>
         </w:rPr>
       </w:pPr>
       <w:r>
@@ -7784,6 +7784,85 @@
         <w:rPr>
           <w:rFonts w:ascii="Aptos" w:eastAsia="Aptos" w:hAnsi="Aptos" w:cs="Aptos"/>
         </w:rPr>
+        <w:t xml:space="preserve">* Clause contains </w:t>
+      </w:r>
+      <w:proofErr w:type="gramStart"/>
+      <w:r>
+        <w:rPr>
+          <w:rFonts w:ascii="Aptos" w:eastAsia="Aptos" w:hAnsi="Aptos" w:cs="Aptos"/>
+        </w:rPr>
+        <w:t>ALL of</w:t>
+      </w:r>
+      <w:proofErr w:type="gramEnd"/>
+      <w:r>
+        <w:rPr>
+          <w:rFonts w:ascii="Aptos" w:eastAsia="Aptos" w:hAnsi="Aptos" w:cs="Aptos"/>
+        </w:rPr>
+        <w:t xml:space="preserve"> the following:</w:t>
+      </w:r>
+    </w:p>
+    <w:p>
+      <w:pPr>
+        <w:rPr>
+          <w:rFonts w:ascii="Aptos" w:eastAsia="Aptos" w:hAnsi="Aptos" w:cs="Aptos"/>
+        </w:rPr>
+      </w:pPr>
+      <w:r>
+        <w:rPr>
+          <w:rFonts w:ascii="Aptos" w:eastAsia="Aptos" w:hAnsi="Aptos" w:cs="Aptos"/>
+        </w:rPr>
+        <w:t xml:space="preserve">  * “exclusive rights”</w:t>
+      </w:r>
+    </w:p>
+    <w:p>
+      <w:pPr>
+        <w:rPr>
+          <w:rFonts w:ascii="Aptos" w:eastAsia="Aptos" w:hAnsi="Aptos" w:cs="Aptos"/>
+        </w:rPr>
+      </w:pPr>
+      <w:r>
+        <w:rPr>
+          <w:rFonts w:ascii="Aptos" w:eastAsia="Aptos" w:hAnsi="Aptos" w:cs="Aptos"/>
+        </w:rPr>
+        <w:t xml:space="preserve">  * “materials”</w:t>
+      </w:r>
+    </w:p>
+    <w:p>
+      <w:pPr>
+        <w:rPr>
+          <w:rFonts w:ascii="Aptos" w:eastAsia="Aptos" w:hAnsi="Aptos" w:cs="Aptos"/>
+        </w:rPr>
+      </w:pPr>
+      <w:r>
+        <w:rPr>
+          <w:rFonts w:ascii="Aptos" w:eastAsia="Aptos" w:hAnsi="Aptos" w:cs="Aptos"/>
+        </w:rPr>
+        <w:t xml:space="preserve">  * “may not use”</w:t>
+      </w:r>
+    </w:p>
+    <w:p>
+      <w:pPr>
+        <w:rPr>
+          <w:rFonts w:ascii="Aptos" w:eastAsia="Aptos" w:hAnsi="Aptos" w:cs="Aptos"/>
+        </w:rPr>
+      </w:pPr>
+      <w:r>
+        <w:rPr>
+          <w:rFonts w:ascii="Aptos" w:eastAsia="Aptos" w:hAnsi="Aptos" w:cs="Aptos"/>
+        </w:rPr>
+        <w:t xml:space="preserve">  * “any other purpose”</w:t>
+      </w:r>
+    </w:p>
+    <w:p>
+      <w:pPr>
+        <w:rPr>
+          <w:rFonts w:ascii="Aptos" w:eastAsia="Aptos" w:hAnsi="Aptos" w:cs="Aptos"/>
+        </w:rPr>
+      </w:pPr>
+      <w:r>
+        <w:rPr>
+          <w:rFonts w:ascii="Aptos" w:eastAsia="Aptos" w:hAnsi="Aptos" w:cs="Aptos"/>
+        </w:rPr>
         <w:t xml:space="preserve"> </w:t>
       </w:r>
     </w:p>
@@ -7901,32 +7980,47 @@
         <w:rPr>
           <w:rFonts w:ascii="Aptos" w:eastAsia="Aptos" w:hAnsi="Aptos" w:cs="Aptos"/>
         </w:rPr>
-        <w:t>* Clause only limits use of Confidential Information to the Purpose or Project</w:t>
-      </w:r>
-    </w:p>
-    <w:p>
-      <w:pPr>
-        <w:rPr>
-          <w:rFonts w:ascii="Aptos" w:eastAsia="Aptos" w:hAnsi="Aptos" w:cs="Aptos"/>
-        </w:rPr>
-      </w:pPr>
-      <w:r>
-        <w:rPr>
-          <w:rFonts w:ascii="Aptos" w:eastAsia="Aptos" w:hAnsi="Aptos" w:cs="Aptos"/>
-        </w:rPr>
-        <w:t>* Clause only prohibits use of Confidential Information for purposes outside the NDA purpose</w:t>
-      </w:r>
-    </w:p>
-    <w:p>
-      <w:pPr>
-        <w:rPr>
-          <w:rFonts w:ascii="Aptos" w:eastAsia="Aptos" w:hAnsi="Aptos" w:cs="Aptos"/>
-        </w:rPr>
-      </w:pPr>
-      <w:r>
-        <w:rPr>
-          <w:rFonts w:ascii="Aptos" w:eastAsia="Aptos" w:hAnsi="Aptos" w:cs="Aptos"/>
-        </w:rPr>
+        <w:t>* Clause only limits use of Confidential Information to the Purpose or Project, provided the clause does NOT grant exclusive rights over materials, content, outputs, deliverables, or similar subject matter and does not otherwise impose an exclusivity restriction.</w:t>
+      </w:r>
+    </w:p>
+    <w:p>
+      <w:pPr>
+        <w:rPr>
+          <w:rFonts w:ascii="Aptos" w:eastAsia="Aptos" w:hAnsi="Aptos" w:cs="Aptos"/>
+        </w:rPr>
+      </w:pPr>
+      <w:r>
+        <w:rPr>
+          <w:rFonts w:ascii="Aptos" w:eastAsia="Aptos" w:hAnsi="Aptos" w:cs="Aptos"/>
+        </w:rPr>
+        <w:t xml:space="preserve">* Clause only prohibits use of Confidential Information for purposes outside the NDA purpose, provided the clause does NOT grant exclusive rights over materials, content, outputs, deliverables, or similar subject matter and does </w:t>
+      </w:r>
+      <w:proofErr w:type="gramStart"/>
+      <w:r>
+        <w:rPr>
+          <w:rFonts w:ascii="Aptos" w:eastAsia="Aptos" w:hAnsi="Aptos" w:cs="Aptos"/>
+        </w:rPr>
+        <w:t>not otherwise</w:t>
+      </w:r>
+      <w:proofErr w:type="gramEnd"/>
+      <w:r>
+        <w:rPr>
+          <w:rFonts w:ascii="Aptos" w:eastAsia="Aptos" w:hAnsi="Aptos" w:cs="Aptos"/>
+        </w:rPr>
+        <w:t xml:space="preserve"> impose an exclusivity restriction.</w:t>
+      </w:r>
+    </w:p>
+    <w:p>
+      <w:pPr>
+        <w:rPr>
+          <w:rFonts w:ascii="Aptos" w:eastAsia="Aptos" w:hAnsi="Aptos" w:cs="Aptos"/>
+        </w:rPr>
+      </w:pPr>
+      <w:r>
+        <w:rPr>
+          <w:rFonts w:ascii="Aptos" w:eastAsia="Aptos" w:hAnsi="Aptos" w:cs="Aptos"/>
+        </w:rPr>
+        <w:lastRenderedPageBreak/>
         <w:t>* Clause only prohibits contacting customers, suppliers, vendors, or connected persons for appraisal, evaluation, due diligence, Project review, or confidentiality-control purposes</w:t>
       </w:r>
     </w:p>
@@ -7993,125 +8087,125 @@
         <w:rPr>
           <w:rFonts w:ascii="Aptos" w:eastAsia="Aptos" w:hAnsi="Aptos" w:cs="Aptos"/>
         </w:rPr>
+        <w:t>* Clause contains “customer” or “supplier” but does not restrict Accenture from providing services to third parties, competitors, or other clients</w:t>
+      </w:r>
+    </w:p>
+    <w:p>
+      <w:pPr>
+        <w:rPr>
+          <w:rFonts w:ascii="Aptos" w:eastAsia="Aptos" w:hAnsi="Aptos" w:cs="Aptos"/>
+        </w:rPr>
+      </w:pPr>
+      <w:r>
+        <w:rPr>
+          <w:rFonts w:ascii="Aptos" w:eastAsia="Aptos" w:hAnsi="Aptos" w:cs="Aptos"/>
+        </w:rPr>
+        <w:t>* Clause contains “customer, supplier, or any other person connected with the Disclosing Party” only in the context of appraisal, evaluation, diligence, Project review, or confidentiality protection</w:t>
+      </w:r>
+    </w:p>
+    <w:p>
+      <w:pPr>
+        <w:rPr>
+          <w:rFonts w:ascii="Aptos" w:eastAsia="Aptos" w:hAnsi="Aptos" w:cs="Aptos"/>
+        </w:rPr>
+      </w:pPr>
+      <w:r>
+        <w:rPr>
+          <w:rFonts w:ascii="Aptos" w:eastAsia="Aptos" w:hAnsi="Aptos" w:cs="Aptos"/>
+        </w:rPr>
+        <w:t>* Restrictions limited to not interfering with business relationships, without a clear restriction on competitive activity, future services, market participation, or business opportunity pursuit</w:t>
+      </w:r>
+    </w:p>
+    <w:p>
+      <w:pPr>
+        <w:rPr>
+          <w:rFonts w:ascii="Aptos" w:eastAsia="Aptos" w:hAnsi="Aptos" w:cs="Aptos"/>
+        </w:rPr>
+      </w:pPr>
+      <w:r>
+        <w:rPr>
+          <w:rFonts w:ascii="Aptos" w:eastAsia="Aptos" w:hAnsi="Aptos" w:cs="Aptos"/>
+        </w:rPr>
+        <w:t xml:space="preserve">* General no-contact clauses related to the Project, unless they also include </w:t>
+      </w:r>
+      <w:proofErr w:type="gramStart"/>
+      <w:r>
+        <w:rPr>
+          <w:rFonts w:ascii="Aptos" w:eastAsia="Aptos" w:hAnsi="Aptos" w:cs="Aptos"/>
+        </w:rPr>
+        <w:t>a clear</w:t>
+      </w:r>
+      <w:proofErr w:type="gramEnd"/>
+      <w:r>
+        <w:rPr>
+          <w:rFonts w:ascii="Aptos" w:eastAsia="Aptos" w:hAnsi="Aptos" w:cs="Aptos"/>
+        </w:rPr>
+        <w:t xml:space="preserve"> non-compete, exclusivity, customer diversion, vendor diversion, or business opportunity restriction</w:t>
+      </w:r>
+    </w:p>
+    <w:p>
+      <w:pPr>
+        <w:rPr>
+          <w:rFonts w:ascii="Aptos" w:eastAsia="Aptos" w:hAnsi="Aptos" w:cs="Aptos"/>
+        </w:rPr>
+      </w:pPr>
+      <w:r>
+        <w:rPr>
+          <w:rFonts w:ascii="Aptos" w:eastAsia="Aptos" w:hAnsi="Aptos" w:cs="Aptos"/>
+        </w:rPr>
+        <w:t>* Do NOT route Non-Compete / Exclusivity where “competitor” appears only to exclude competitor consultants, advisors, or representatives from receiving Confidential Information, without requiring Accenture to disclose, notify, indicate, report, limit, stop, or avoid work with a competitor.</w:t>
+      </w:r>
+    </w:p>
+    <w:p>
+      <w:pPr>
+        <w:rPr>
+          <w:rFonts w:ascii="Aptos" w:eastAsia="Aptos" w:hAnsi="Aptos" w:cs="Aptos"/>
+        </w:rPr>
+      </w:pPr>
+      <w:r>
+        <w:rPr>
+          <w:rFonts w:ascii="Aptos" w:eastAsia="Aptos" w:hAnsi="Aptos" w:cs="Aptos"/>
+        </w:rPr>
+        <w:t>* Do NOT route Non-Compete / Exclusivity where “competitor” appears only in a confidentiality-control provision and does not relate to Accenture being contracted to, working for, consulting for, providing services to, or pursuing work with a competitor.</w:t>
+      </w:r>
+    </w:p>
+    <w:p>
+      <w:pPr>
+        <w:rPr>
+          <w:rFonts w:ascii="Aptos" w:eastAsia="Aptos" w:hAnsi="Aptos" w:cs="Aptos"/>
+        </w:rPr>
+      </w:pPr>
+      <w:r>
+        <w:rPr>
+          <w:rFonts w:ascii="Aptos" w:eastAsia="Aptos" w:hAnsi="Aptos" w:cs="Aptos"/>
+        </w:rPr>
+        <w:t>* Do NOT route Non-Compete / Exclusivity where the clause merely states that Confidential Information must not be disclosed to competitors, without any obligation to disclose competitor relationships or restrict business activity.</w:t>
+      </w:r>
+    </w:p>
+    <w:p>
+      <w:pPr>
+        <w:rPr>
+          <w:rFonts w:ascii="Aptos" w:eastAsia="Aptos" w:hAnsi="Aptos" w:cs="Aptos"/>
+        </w:rPr>
+      </w:pPr>
+      <w:r>
+        <w:rPr>
+          <w:rFonts w:ascii="Aptos" w:eastAsia="Aptos" w:hAnsi="Aptos" w:cs="Aptos"/>
+        </w:rPr>
+        <w:t xml:space="preserve"> </w:t>
+      </w:r>
+    </w:p>
+    <w:p>
+      <w:pPr>
+        <w:rPr>
+          <w:rFonts w:ascii="Aptos" w:eastAsia="Aptos" w:hAnsi="Aptos" w:cs="Aptos"/>
+        </w:rPr>
+      </w:pPr>
+      <w:r>
+        <w:rPr>
+          <w:rFonts w:ascii="Aptos" w:eastAsia="Aptos" w:hAnsi="Aptos" w:cs="Aptos"/>
+        </w:rPr>
         <w:lastRenderedPageBreak/>
-        <w:t>* Clause contains “customer” or “supplier” but does not restrict Accenture from providing services to third parties, competitors, or other clients</w:t>
-      </w:r>
-    </w:p>
-    <w:p>
-      <w:pPr>
-        <w:rPr>
-          <w:rFonts w:ascii="Aptos" w:eastAsia="Aptos" w:hAnsi="Aptos" w:cs="Aptos"/>
-        </w:rPr>
-      </w:pPr>
-      <w:r>
-        <w:rPr>
-          <w:rFonts w:ascii="Aptos" w:eastAsia="Aptos" w:hAnsi="Aptos" w:cs="Aptos"/>
-        </w:rPr>
-        <w:t>* Clause contains “customer, supplier, or any other person connected with the Disclosing Party” only in the context of appraisal, evaluation, diligence, Project review, or confidentiality protection</w:t>
-      </w:r>
-    </w:p>
-    <w:p>
-      <w:pPr>
-        <w:rPr>
-          <w:rFonts w:ascii="Aptos" w:eastAsia="Aptos" w:hAnsi="Aptos" w:cs="Aptos"/>
-        </w:rPr>
-      </w:pPr>
-      <w:r>
-        <w:rPr>
-          <w:rFonts w:ascii="Aptos" w:eastAsia="Aptos" w:hAnsi="Aptos" w:cs="Aptos"/>
-        </w:rPr>
-        <w:t>* Restrictions limited to not interfering with business relationships, without a clear restriction on competitive activity, future services, market participation, or business opportunity pursuit</w:t>
-      </w:r>
-    </w:p>
-    <w:p>
-      <w:pPr>
-        <w:rPr>
-          <w:rFonts w:ascii="Aptos" w:eastAsia="Aptos" w:hAnsi="Aptos" w:cs="Aptos"/>
-        </w:rPr>
-      </w:pPr>
-      <w:r>
-        <w:rPr>
-          <w:rFonts w:ascii="Aptos" w:eastAsia="Aptos" w:hAnsi="Aptos" w:cs="Aptos"/>
-        </w:rPr>
-        <w:t xml:space="preserve">* General no-contact clauses related to the Project, unless they also include </w:t>
-      </w:r>
-      <w:proofErr w:type="gramStart"/>
-      <w:r>
-        <w:rPr>
-          <w:rFonts w:ascii="Aptos" w:eastAsia="Aptos" w:hAnsi="Aptos" w:cs="Aptos"/>
-        </w:rPr>
-        <w:t>a clear</w:t>
-      </w:r>
-      <w:proofErr w:type="gramEnd"/>
-      <w:r>
-        <w:rPr>
-          <w:rFonts w:ascii="Aptos" w:eastAsia="Aptos" w:hAnsi="Aptos" w:cs="Aptos"/>
-        </w:rPr>
-        <w:t xml:space="preserve"> non-compete, exclusivity, customer diversion, vendor diversion, or business opportunity restriction</w:t>
-      </w:r>
-    </w:p>
-    <w:p>
-      <w:pPr>
-        <w:rPr>
-          <w:rFonts w:ascii="Aptos" w:eastAsia="Aptos" w:hAnsi="Aptos" w:cs="Aptos"/>
-        </w:rPr>
-      </w:pPr>
-      <w:r>
-        <w:rPr>
-          <w:rFonts w:ascii="Aptos" w:eastAsia="Aptos" w:hAnsi="Aptos" w:cs="Aptos"/>
-        </w:rPr>
-        <w:t>* Do NOT route Non-Compete / Exclusivity where “competitor” appears only to exclude competitor consultants, advisors, or representatives from receiving Confidential Information, without requiring Accenture to disclose, notify, indicate, report, limit, stop, or avoid work with a competitor.</w:t>
-      </w:r>
-    </w:p>
-    <w:p>
-      <w:pPr>
-        <w:rPr>
-          <w:rFonts w:ascii="Aptos" w:eastAsia="Aptos" w:hAnsi="Aptos" w:cs="Aptos"/>
-        </w:rPr>
-      </w:pPr>
-      <w:r>
-        <w:rPr>
-          <w:rFonts w:ascii="Aptos" w:eastAsia="Aptos" w:hAnsi="Aptos" w:cs="Aptos"/>
-        </w:rPr>
-        <w:t>* Do NOT route Non-Compete / Exclusivity where “competitor” appears only in a confidentiality-control provision and does not relate to Accenture being contracted to, working for, consulting for, providing services to, or pursuing work with a competitor.</w:t>
-      </w:r>
-    </w:p>
-    <w:p>
-      <w:pPr>
-        <w:rPr>
-          <w:rFonts w:ascii="Aptos" w:eastAsia="Aptos" w:hAnsi="Aptos" w:cs="Aptos"/>
-        </w:rPr>
-      </w:pPr>
-      <w:r>
-        <w:rPr>
-          <w:rFonts w:ascii="Aptos" w:eastAsia="Aptos" w:hAnsi="Aptos" w:cs="Aptos"/>
-        </w:rPr>
-        <w:t>* Do NOT route Non-Compete / Exclusivity where the clause merely states that Confidential Information must not be disclosed to competitors, without any obligation to disclose competitor relationships or restrict business activity.</w:t>
-      </w:r>
-    </w:p>
-    <w:p>
-      <w:pPr>
-        <w:rPr>
-          <w:rFonts w:ascii="Aptos" w:eastAsia="Aptos" w:hAnsi="Aptos" w:cs="Aptos"/>
-        </w:rPr>
-      </w:pPr>
-      <w:r>
-        <w:rPr>
-          <w:rFonts w:ascii="Aptos" w:eastAsia="Aptos" w:hAnsi="Aptos" w:cs="Aptos"/>
-        </w:rPr>
-        <w:t xml:space="preserve"> </w:t>
-      </w:r>
-    </w:p>
-    <w:p>
-      <w:pPr>
-        <w:rPr>
-          <w:rFonts w:ascii="Aptos" w:eastAsia="Aptos" w:hAnsi="Aptos" w:cs="Aptos"/>
-        </w:rPr>
-      </w:pPr>
-      <w:r>
-        <w:rPr>
-          <w:rFonts w:ascii="Aptos" w:eastAsia="Aptos" w:hAnsi="Aptos" w:cs="Aptos"/>
-        </w:rPr>
         <w:t>## Conflict Resolution Rule</w:t>
       </w:r>
     </w:p>
@@ -33496,15 +33590,6 @@
 </file>
 
 <file path=customXml/item1.xml><?xml version="1.0" encoding="utf-8"?>
-<?mso-contentType ?>
-<FormTemplates xmlns="http://schemas.microsoft.com/sharepoint/v3/contenttype/forms">
-  <Display>DocumentLibraryForm</Display>
-  <Edit>DocumentLibraryForm</Edit>
-  <New>DocumentLibraryForm</New>
-</FormTemplates>
-</file>
-
-<file path=customXml/item2.xml><?xml version="1.0" encoding="utf-8"?>
 <ct:contentTypeSchema xmlns:ct="http://schemas.microsoft.com/office/2006/metadata/contentType" xmlns:ma="http://schemas.microsoft.com/office/2006/metadata/properties/metaAttributes" ct:_="" ma:_="" ma:contentTypeName="Document" ma:contentTypeID="0x010100A5AA8A3CABF36C429B74A94C24258E55" ma:contentTypeVersion="21" ma:contentTypeDescription="Create a new document." ma:contentTypeScope="" ma:versionID="9d590b9c745b5d4d086e55351edde6c7">
   <xsd:schema xmlns:xsd="http://www.w3.org/2001/XMLSchema" xmlns:xs="http://www.w3.org/2001/XMLSchema" xmlns:p="http://schemas.microsoft.com/office/2006/metadata/properties" xmlns:ns2="aba9ad68-f961-4806-8372-ded3e8039a5f" xmlns:ns3="58fb48c5-ad38-47d1-9aa6-9b4f1dc114f9" targetNamespace="http://schemas.microsoft.com/office/2006/metadata/properties" ma:root="true" ma:fieldsID="656ed3350af39d0ad06ab4725df265a1" ns2:_="" ns3:_="">
     <xsd:import namespace="aba9ad68-f961-4806-8372-ded3e8039a5f"/>
@@ -33771,6 +33856,15 @@
 </ct:contentTypeSchema>
 </file>
 
+<file path=customXml/item2.xml><?xml version="1.0" encoding="utf-8"?>
+<?mso-contentType ?>
+<FormTemplates xmlns="http://schemas.microsoft.com/sharepoint/v3/contenttype/forms">
+  <Display>DocumentLibraryForm</Display>
+  <Edit>DocumentLibraryForm</Edit>
+  <New>DocumentLibraryForm</New>
+</FormTemplates>
+</file>
+
 <file path=customXml/item3.xml><?xml version="1.0" encoding="utf-8"?>
 <p:properties xmlns:p="http://schemas.microsoft.com/office/2006/metadata/properties" xmlns:xsi="http://www.w3.org/2001/XMLSchema-instance" xmlns:pc="http://schemas.microsoft.com/office/infopath/2007/PartnerControls">
   <documentManagement>
@@ -33784,14 +33878,6 @@
 </file>
 
 <file path=customXml/itemProps1.xml><?xml version="1.0" encoding="utf-8"?>
-<ds:datastoreItem xmlns:ds="http://schemas.openxmlformats.org/officeDocument/2006/customXml" ds:itemID="{C6DFF534-1887-4C42-BC36-EDACE7DE72C0}">
-  <ds:schemaRefs>
-    <ds:schemaRef ds:uri="http://schemas.microsoft.com/sharepoint/v3/contenttype/forms"/>
-  </ds:schemaRefs>
-</ds:datastoreItem>
-</file>
-
-<file path=customXml/itemProps2.xml><?xml version="1.0" encoding="utf-8"?>
 <ds:datastoreItem xmlns:ds="http://schemas.openxmlformats.org/officeDocument/2006/customXml" ds:itemID="{06BBAEB0-F6D0-405B-9BC5-9D7675839774}">
   <ds:schemaRefs>
     <ds:schemaRef ds:uri="http://schemas.microsoft.com/office/2006/metadata/contentType"/>
@@ -33806,6 +33892,14 @@
     <ds:schemaRef ds:uri="http://purl.org/dc/elements/1.1/"/>
     <ds:schemaRef ds:uri="http://purl.org/dc/terms/"/>
     <ds:schemaRef ds:uri="http://schemas.microsoft.com/internal/obd"/>
+  </ds:schemaRefs>
+</ds:datastoreItem>
+</file>
+
+<file path=customXml/itemProps2.xml><?xml version="1.0" encoding="utf-8"?>
+<ds:datastoreItem xmlns:ds="http://schemas.openxmlformats.org/officeDocument/2006/customXml" ds:itemID="{C6DFF534-1887-4C42-BC36-EDACE7DE72C0}">
+  <ds:schemaRefs>
+    <ds:schemaRef ds:uri="http://schemas.microsoft.com/sharepoint/v3/contenttype/forms"/>
   </ds:schemaRefs>
 </ds:datastoreItem>
 </file>

</xml_diff>